<commit_message>
feat: complete add amplify auth to app
</commit_message>
<xml_diff>
--- a/Note.docx
+++ b/Note.docx
@@ -4,97 +4,127 @@
   <w:body>
     <w:p>
       <w:r>
-        <w:t>lib/</w:t>
-      </w:r>
-    </w:p>
-    <w:p>
-      <w:r>
-        <w:t>├── models/</w:t>
-      </w:r>
-    </w:p>
-    <w:p>
-      <w:r>
-        <w:t>│   └── user.dart</w:t>
-      </w:r>
-    </w:p>
-    <w:p>
-      <w:r>
-        <w:t>├── screens/</w:t>
-      </w:r>
-    </w:p>
-    <w:p>
-      <w:r>
-        <w:t>│   ├── auth/</w:t>
-      </w:r>
-    </w:p>
-    <w:p>
-      <w:r>
-        <w:t>│   │   ├── login_screen.dart</w:t>
-      </w:r>
-    </w:p>
-    <w:p>
-      <w:r>
-        <w:t>│   │   ├── signup_screen.dart</w:t>
-      </w:r>
-    </w:p>
-    <w:p>
-      <w:r>
-        <w:t>│   │   ├── otp_screen.dart</w:t>
-      </w:r>
-    </w:p>
-    <w:p>
-      <w:r>
-        <w:t>│   │   └── forgot_password_screen.dart</w:t>
-      </w:r>
-    </w:p>
-    <w:p>
-      <w:r>
-        <w:t>│   ├── main/</w:t>
-      </w:r>
-    </w:p>
-    <w:p>
-      <w:r>
-        <w:t>│   │   ├── home_screen.dart</w:t>
-      </w:r>
-    </w:p>
-    <w:p>
-      <w:r>
-        <w:t>│   │   ├── profile_screen.dart</w:t>
-      </w:r>
-    </w:p>
-    <w:p>
-      <w:r>
-        <w:t>│   │   └── settings_screen.dart</w:t>
-      </w:r>
-    </w:p>
-    <w:p>
-      <w:r>
-        <w:t>├── widgets/</w:t>
-      </w:r>
-    </w:p>
-    <w:p>
-      <w:r>
-        <w:t>│   └── custom_button.dart</w:t>
-      </w:r>
-    </w:p>
-    <w:p>
-      <w:r>
-        <w:t>├── services/</w:t>
-      </w:r>
-    </w:p>
-    <w:p>
-      <w:r>
-        <w:t>│   └── auth_service.dart</w:t>
-      </w:r>
-    </w:p>
-    <w:p>
-      <w:r>
-        <w:t>├── routes.dart</w:t>
-      </w:r>
-    </w:p>
-    <w:p>
-      <w:r>
-        <w:t>└── main.dart</w:t>
+        <w:t>/lib</w:t>
+      </w:r>
+    </w:p>
+    <w:p>
+      <w:r>
+        <w:t>│── main.dart</w:t>
+      </w:r>
+    </w:p>
+    <w:p>
+      <w:r>
+        <w:t>│── core/</w:t>
+      </w:r>
+    </w:p>
+    <w:p>
+      <w:r>
+        <w:t>│   │── services/</w:t>
+      </w:r>
+    </w:p>
+    <w:p>
+      <w:r>
+        <w:t>│   │   │── auth_service.dart   // Xử lý xác thực bằng token</w:t>
+      </w:r>
+    </w:p>
+    <w:p>
+      <w:r>
+        <w:t>│   │── utils/</w:t>
+      </w:r>
+    </w:p>
+    <w:p>
+      <w:r>
+        <w:t>│   │   │── validators.dart     // Kiểm tra đầu vào email, password</w:t>
+      </w:r>
+    </w:p>
+    <w:p>
+      <w:r>
+        <w:t>│── data/</w:t>
+      </w:r>
+    </w:p>
+    <w:p>
+      <w:r>
+        <w:t>│   │── models/</w:t>
+      </w:r>
+    </w:p>
+    <w:p>
+      <w:r>
+        <w:t>│   │   │── user_model.dart     // Định nghĩa model người dùng</w:t>
+      </w:r>
+    </w:p>
+    <w:p>
+      <w:r>
+        <w:t>│   │── repositories/</w:t>
+      </w:r>
+    </w:p>
+    <w:p>
+      <w:r>
+        <w:t>│   │   │── user_repository.dart // Giao tiếp với backend</w:t>
+      </w:r>
+    </w:p>
+    <w:p>
+      <w:r>
+        <w:t>│── presentation/</w:t>
+      </w:r>
+    </w:p>
+    <w:p>
+      <w:r>
+        <w:t>│   │── screens/</w:t>
+      </w:r>
+    </w:p>
+    <w:p>
+      <w:r>
+        <w:t>│   │   │── auth/</w:t>
+      </w:r>
+    </w:p>
+    <w:p>
+      <w:r>
+        <w:t>│   │   │   │── login_screen.dart</w:t>
+      </w:r>
+    </w:p>
+    <w:p>
+      <w:r>
+        <w:t>│   │   │   │── register_screen.dart</w:t>
+      </w:r>
+    </w:p>
+    <w:p>
+      <w:r>
+        <w:t>│   │   │   │── forgot_password_screen.dart</w:t>
+      </w:r>
+    </w:p>
+    <w:p>
+      <w:r>
+        <w:t>│   │   │── home/</w:t>
+      </w:r>
+    </w:p>
+    <w:p>
+      <w:r>
+        <w:t>│   │   │   │── home_screen.dart</w:t>
+      </w:r>
+    </w:p>
+    <w:p>
+      <w:r>
+        <w:t>│   │   │   │── profile_screen.dart</w:t>
+      </w:r>
+    </w:p>
+    <w:p>
+      <w:r>
+        <w:t>│   │── widgets/</w:t>
+      </w:r>
+    </w:p>
+    <w:p>
+      <w:r>
+        <w:t>│   │   │── bottom_nav.dart</w:t>
+      </w:r>
+    </w:p>
+    <w:p>
+      <w:r>
+        <w:t>│── routes/</w:t>
+      </w:r>
+    </w:p>
+    <w:p>
+      <w:r>
+        <w:t>│   │── app_routes.dart</w:t>
       </w:r>
     </w:p>
     <w:sectPr>
@@ -710,6 +740,7 @@
   <w:style w:type="character" w:default="1" w:styleId="DefaultParagraphFont">
     <w:name w:val="Default Paragraph Font"/>
     <w:uiPriority w:val="1"/>
+    <w:semiHidden/>
     <w:unhideWhenUsed/>
   </w:style>
   <w:style w:type="table" w:default="1" w:styleId="TableNormal">

</xml_diff>